<commit_message>
Add excluded_schemas so unwanted DDL cannot fail the load
tables= already skipped decoding an unwanted COPY block, but its CREATE
TABLE was still fully parsed. A construct the hand-rolled DDL parser
cannot handle, sitting in a schema nobody wants (audit, staging, ...),
would fail the whole daily load anyway. excluded_schemas skips a
table's CREATE TABLE at the scanner level, reading only far enough to
find where the statement ends, so its DDL can never fail the load.

Co-Authored-By: Claude Sonnet 5 <noreply@anthropic.com>
Claude-Session: https://claude.ai/code/session_01Ua6xH9wj5JEw7EG2QU2W9q
</commit_message>
<xml_diff>
--- a/docs/api.docx
+++ b/docs/api.docx
@@ -1220,6 +1220,8 @@
         <w:t xml:space="preserve">    *,</w:t>
         <w:br/>
         <w:t xml:space="preserve">    tables=None,</w:t>
+        <w:br/>
+        <w:t xml:space="preserve">    excluded_schemas=None,</w:t>
         <w:br/>
         <w:t xml:space="preserve">    mode="overwrite",</w:t>
         <w:br/>
@@ -1856,6 +1858,78 @@
                 <w:rFonts w:ascii="Consolas" w:hAnsi="Consolas" w:eastAsia="Consolas"/>
                 <w:sz w:val="18"/>
               </w:rPr>
+              <w:t>excluded_schemas</w:t>
+            </w:r>
+          </w:p>
+        </w:tc>
+        <w:tc>
+          <w:tcPr>
+            <w:tcW w:type="dxa" w:w="2351"/>
+          </w:tcPr>
+          <w:p>
+            <w:r>
+              <w:rPr>
+                <w:rFonts w:ascii="Consolas" w:hAnsi="Consolas" w:eastAsia="Consolas"/>
+                <w:sz w:val="18"/>
+              </w:rPr>
+              <w:t>list[str]</w:t>
+            </w:r>
+            <w:r>
+              <w:rPr>
+                <w:rFonts w:ascii="Times New Roman" w:hAnsi="Times New Roman" w:eastAsia="Batang"/>
+                <w:sz w:val="22"/>
+              </w:rPr>
+              <w:t xml:space="preserve"> or </w:t>
+            </w:r>
+            <w:r>
+              <w:rPr>
+                <w:rFonts w:ascii="Consolas" w:hAnsi="Consolas" w:eastAsia="Consolas"/>
+                <w:sz w:val="18"/>
+              </w:rPr>
+              <w:t>None</w:t>
+            </w:r>
+          </w:p>
+        </w:tc>
+        <w:tc>
+          <w:tcPr>
+            <w:tcW w:type="dxa" w:w="2351"/>
+          </w:tcPr>
+          <w:p>
+            <w:r>
+              <w:rPr>
+                <w:rFonts w:ascii="Consolas" w:hAnsi="Consolas" w:eastAsia="Consolas"/>
+                <w:sz w:val="18"/>
+              </w:rPr>
+              <w:t>None</w:t>
+            </w:r>
+          </w:p>
+        </w:tc>
+        <w:tc>
+          <w:tcPr>
+            <w:tcW w:type="dxa" w:w="2351"/>
+          </w:tcPr>
+          <w:p>
+            <w:r>
+              <w:rPr>
+                <w:rFonts w:ascii="Times New Roman" w:hAnsi="Times New Roman" w:eastAsia="Batang"/>
+                <w:sz w:val="22"/>
+              </w:rPr>
+              <w:t>PostgreSQL schema (namespace) names to exclude entirely. See Chapter V, Section 2</w:t>
+            </w:r>
+          </w:p>
+        </w:tc>
+      </w:tr>
+      <w:tr>
+        <w:tc>
+          <w:tcPr>
+            <w:tcW w:type="dxa" w:w="2351"/>
+          </w:tcPr>
+          <w:p>
+            <w:r>
+              <w:rPr>
+                <w:rFonts w:ascii="Consolas" w:hAnsi="Consolas" w:eastAsia="Consolas"/>
+                <w:sz w:val="18"/>
+              </w:rPr>
               <w:t>mode</w:t>
             </w:r>
           </w:p>
@@ -7251,6 +7325,137 @@
           <w:sz w:val="22"/>
         </w:rPr>
         <w:t xml:space="preserve"> against your list.</w:t>
+      </w:r>
+    </w:p>
+    <w:p>
+      <w:pPr>
+        <w:spacing w:line="384" w:lineRule="auto" w:after="120"/>
+        <w:jc w:val="both"/>
+      </w:pPr>
+      <w:r>
+        <w:rPr>
+          <w:rFonts w:ascii="Consolas" w:hAnsi="Consolas" w:eastAsia="Consolas"/>
+          <w:sz w:val="18"/>
+        </w:rPr>
+        <w:t>excluded_schemas</w:t>
+      </w:r>
+      <w:r>
+        <w:rPr>
+          <w:rFonts w:ascii="Times New Roman" w:hAnsi="Times New Roman" w:eastAsia="Batang"/>
+          <w:sz w:val="22"/>
+        </w:rPr>
+        <w:t xml:space="preserve"> matches against the PostgreSQL schema (namespace) part of the name, for example </w:t>
+      </w:r>
+      <w:r>
+        <w:rPr>
+          <w:rFonts w:ascii="Consolas" w:hAnsi="Consolas" w:eastAsia="Consolas"/>
+          <w:sz w:val="18"/>
+        </w:rPr>
+        <w:t>"audit"</w:t>
+      </w:r>
+      <w:r>
+        <w:rPr>
+          <w:rFonts w:ascii="Times New Roman" w:hAnsi="Times New Roman" w:eastAsia="Batang"/>
+          <w:sz w:val="22"/>
+        </w:rPr>
+        <w:t xml:space="preserve"> in </w:t>
+      </w:r>
+      <w:r>
+        <w:rPr>
+          <w:rFonts w:ascii="Consolas" w:hAnsi="Consolas" w:eastAsia="Consolas"/>
+          <w:sz w:val="18"/>
+        </w:rPr>
+        <w:t>"audit.log"</w:t>
+      </w:r>
+      <w:r>
+        <w:rPr>
+          <w:rFonts w:ascii="Times New Roman" w:hAnsi="Times New Roman" w:eastAsia="Batang"/>
+          <w:sz w:val="22"/>
+        </w:rPr>
+        <w:t xml:space="preserve">. It goes one step further than </w:t>
+      </w:r>
+      <w:r>
+        <w:rPr>
+          <w:rFonts w:ascii="Consolas" w:hAnsi="Consolas" w:eastAsia="Consolas"/>
+          <w:sz w:val="18"/>
+        </w:rPr>
+        <w:t>tables</w:t>
+      </w:r>
+      <w:r>
+        <w:rPr>
+          <w:rFonts w:ascii="Times New Roman" w:hAnsi="Times New Roman" w:eastAsia="Batang"/>
+          <w:sz w:val="22"/>
+        </w:rPr>
+        <w:t xml:space="preserve">: an excluded table's </w:t>
+      </w:r>
+      <w:r>
+        <w:rPr>
+          <w:rFonts w:ascii="Consolas" w:hAnsi="Consolas" w:eastAsia="Consolas"/>
+          <w:sz w:val="18"/>
+        </w:rPr>
+        <w:t>CREATE TABLE</w:t>
+      </w:r>
+      <w:r>
+        <w:rPr>
+          <w:rFonts w:ascii="Times New Roman" w:hAnsi="Times New Roman" w:eastAsia="Batang"/>
+          <w:sz w:val="22"/>
+        </w:rPr>
+        <w:t xml:space="preserve"> is not just left unloaded, it is never fully parsed. The scanner reads only as far as the table's qualified name, then skips forward to the statement's end without parsing a single column. Practically, this means a DDL construct in a schema you never wanted, that this library's hand-rolled parser cannot handle, cannot fail the load; had that table instead only been left out of </w:t>
+      </w:r>
+      <w:r>
+        <w:rPr>
+          <w:rFonts w:ascii="Consolas" w:hAnsi="Consolas" w:eastAsia="Consolas"/>
+          <w:sz w:val="18"/>
+        </w:rPr>
+        <w:t>tables</w:t>
+      </w:r>
+      <w:r>
+        <w:rPr>
+          <w:rFonts w:ascii="Times New Roman" w:hAnsi="Times New Roman" w:eastAsia="Batang"/>
+          <w:sz w:val="22"/>
+        </w:rPr>
+        <w:t>, its DDL would still have been parsed in full and any parse failure there would still fail the whole load, because the scanner cannot know in advance which tables the caller wants.</w:t>
+      </w:r>
+    </w:p>
+    <w:p>
+      <w:pPr>
+        <w:spacing w:line="384" w:lineRule="auto" w:after="120"/>
+        <w:jc w:val="both"/>
+      </w:pPr>
+      <w:r>
+        <w:rPr>
+          <w:rFonts w:ascii="Times New Roman" w:hAnsi="Times New Roman" w:eastAsia="Batang"/>
+          <w:sz w:val="22"/>
+        </w:rPr>
+        <w:t xml:space="preserve">A table named in </w:t>
+      </w:r>
+      <w:r>
+        <w:rPr>
+          <w:rFonts w:ascii="Consolas" w:hAnsi="Consolas" w:eastAsia="Consolas"/>
+          <w:sz w:val="18"/>
+        </w:rPr>
+        <w:t>tables</w:t>
+      </w:r>
+      <w:r>
+        <w:rPr>
+          <w:rFonts w:ascii="Times New Roman" w:hAnsi="Times New Roman" w:eastAsia="Batang"/>
+          <w:sz w:val="22"/>
+        </w:rPr>
+        <w:t xml:space="preserve"> but sitting in a schema named in </w:t>
+      </w:r>
+      <w:r>
+        <w:rPr>
+          <w:rFonts w:ascii="Consolas" w:hAnsi="Consolas" w:eastAsia="Consolas"/>
+          <w:sz w:val="18"/>
+        </w:rPr>
+        <w:t>excluded_schemas</w:t>
+      </w:r>
+      <w:r>
+        <w:rPr>
+          <w:rFonts w:ascii="Times New Roman" w:hAnsi="Times New Roman" w:eastAsia="Batang"/>
+          <w:sz w:val="22"/>
+        </w:rPr>
+        <w:t xml:space="preserve"> is excluded: the schema exclusion is the stronger, more specific statement of intent and wins.</w:t>
       </w:r>
     </w:p>
     <w:p>
@@ -8878,6 +9083,36 @@
                 <w:sz w:val="22"/>
               </w:rPr>
               <w:t>You need a subset. Skipping a block is nearly free</w:t>
+            </w:r>
+          </w:p>
+        </w:tc>
+      </w:tr>
+      <w:tr>
+        <w:tc>
+          <w:tcPr>
+            <w:tcW w:type="dxa" w:w="4702"/>
+          </w:tcPr>
+          <w:p>
+            <w:r>
+              <w:rPr>
+                <w:rFonts w:ascii="Consolas" w:hAnsi="Consolas" w:eastAsia="Consolas"/>
+                <w:sz w:val="18"/>
+              </w:rPr>
+              <w:t>excluded_schemas</w:t>
+            </w:r>
+          </w:p>
+        </w:tc>
+        <w:tc>
+          <w:tcPr>
+            <w:tcW w:type="dxa" w:w="4702"/>
+          </w:tcPr>
+          <w:p>
+            <w:r>
+              <w:rPr>
+                <w:rFonts w:ascii="Times New Roman" w:hAnsi="Times New Roman" w:eastAsia="Batang"/>
+                <w:sz w:val="22"/>
+              </w:rPr>
+              <w:t>You never want an entire schema, especially one whose DDL this library might not parse</w:t>
             </w:r>
           </w:p>
         </w:tc>

</xml_diff>